<commit_message>
docs(validation): added Validation Summary Report Template
</commit_message>
<xml_diff>
--- a/docs/validation/Validation Summary Report.docx
+++ b/docs/validation/Validation Summary Report.docx
@@ -498,10 +498,7 @@
               <w:right w:w="120" w:type="dxa"/>
             </w:tcMar>
           </w:tcPr>
-          <w:p>
-            <w:bookmarkStart w:id="0" w:name="_GoBack"/>
-            <w:bookmarkEnd w:id="0"/>
-          </w:p>
+          <w:p/>
         </w:tc>
         <w:tc>
           <w:tcPr>
@@ -1895,7 +1892,7 @@
       </w:tblGrid>
       <w:tr>
         <w:trPr>
-          <w:trHeight w:val="1728"/>
+          <w:trHeight w:val="7488"/>
         </w:trPr>
         <w:tc>
           <w:tcPr>
@@ -2238,7 +2235,7 @@
       </w:tblGrid>
       <w:tr>
         <w:trPr>
-          <w:trHeight w:val="3024"/>
+          <w:trHeight w:val="8496"/>
         </w:trPr>
         <w:tc>
           <w:tcPr>
@@ -3012,6 +3009,2106 @@
           </w:p>
         </w:tc>
       </w:tr>
+      <w:tr>
+        <w:trPr>
+          <w:cantSplit/>
+        </w:trPr>
+        <w:tc>
+          <w:tcPr>
+            <w:tcW w:w="1150" w:type="dxa"/>
+            <w:tcMar>
+              <w:top w:w="90" w:type="dxa"/>
+              <w:left w:w="100" w:type="dxa"/>
+              <w:bottom w:w="90" w:type="dxa"/>
+              <w:right w:w="100" w:type="dxa"/>
+            </w:tcMar>
+          </w:tcPr>
+          <w:p>
+            <w:pPr>
+              <w:rPr>
+                <w:color w:val="1F2937"/>
+                <w:sz w:val="19"/>
+                <w:szCs w:val="19"/>
+              </w:rPr>
+            </w:pPr>
+          </w:p>
+        </w:tc>
+        <w:tc>
+          <w:tcPr>
+            <w:tcW w:w="3460" w:type="dxa"/>
+            <w:tcMar>
+              <w:top w:w="90" w:type="dxa"/>
+              <w:left w:w="100" w:type="dxa"/>
+              <w:bottom w:w="90" w:type="dxa"/>
+              <w:right w:w="100" w:type="dxa"/>
+            </w:tcMar>
+          </w:tcPr>
+          <w:p>
+            <w:pPr>
+              <w:rPr>
+                <w:color w:val="1F2937"/>
+                <w:sz w:val="19"/>
+                <w:szCs w:val="19"/>
+              </w:rPr>
+            </w:pPr>
+          </w:p>
+        </w:tc>
+        <w:tc>
+          <w:tcPr>
+            <w:tcW w:w="1320" w:type="dxa"/>
+            <w:tcMar>
+              <w:top w:w="90" w:type="dxa"/>
+              <w:left w:w="100" w:type="dxa"/>
+              <w:bottom w:w="90" w:type="dxa"/>
+              <w:right w:w="100" w:type="dxa"/>
+            </w:tcMar>
+          </w:tcPr>
+          <w:p>
+            <w:pPr>
+              <w:rPr>
+                <w:color w:val="1F2937"/>
+                <w:sz w:val="19"/>
+                <w:szCs w:val="19"/>
+              </w:rPr>
+            </w:pPr>
+          </w:p>
+        </w:tc>
+        <w:tc>
+          <w:tcPr>
+            <w:tcW w:w="2110" w:type="dxa"/>
+            <w:tcMar>
+              <w:top w:w="90" w:type="dxa"/>
+              <w:left w:w="100" w:type="dxa"/>
+              <w:bottom w:w="90" w:type="dxa"/>
+              <w:right w:w="100" w:type="dxa"/>
+            </w:tcMar>
+          </w:tcPr>
+          <w:p>
+            <w:pPr>
+              <w:rPr>
+                <w:color w:val="1F2937"/>
+                <w:sz w:val="19"/>
+                <w:szCs w:val="19"/>
+              </w:rPr>
+            </w:pPr>
+          </w:p>
+        </w:tc>
+        <w:tc>
+          <w:tcPr>
+            <w:tcW w:w="1320" w:type="dxa"/>
+            <w:tcMar>
+              <w:top w:w="90" w:type="dxa"/>
+              <w:left w:w="100" w:type="dxa"/>
+              <w:bottom w:w="90" w:type="dxa"/>
+              <w:right w:w="100" w:type="dxa"/>
+            </w:tcMar>
+          </w:tcPr>
+          <w:p>
+            <w:pPr>
+              <w:rPr>
+                <w:color w:val="1F2937"/>
+                <w:sz w:val="19"/>
+                <w:szCs w:val="19"/>
+              </w:rPr>
+            </w:pPr>
+          </w:p>
+        </w:tc>
+      </w:tr>
+      <w:tr>
+        <w:trPr>
+          <w:cantSplit/>
+        </w:trPr>
+        <w:tc>
+          <w:tcPr>
+            <w:tcW w:w="1150" w:type="dxa"/>
+            <w:tcMar>
+              <w:top w:w="90" w:type="dxa"/>
+              <w:left w:w="100" w:type="dxa"/>
+              <w:bottom w:w="90" w:type="dxa"/>
+              <w:right w:w="100" w:type="dxa"/>
+            </w:tcMar>
+          </w:tcPr>
+          <w:p>
+            <w:pPr>
+              <w:rPr>
+                <w:color w:val="1F2937"/>
+                <w:sz w:val="19"/>
+                <w:szCs w:val="19"/>
+              </w:rPr>
+            </w:pPr>
+          </w:p>
+        </w:tc>
+        <w:tc>
+          <w:tcPr>
+            <w:tcW w:w="3460" w:type="dxa"/>
+            <w:tcMar>
+              <w:top w:w="90" w:type="dxa"/>
+              <w:left w:w="100" w:type="dxa"/>
+              <w:bottom w:w="90" w:type="dxa"/>
+              <w:right w:w="100" w:type="dxa"/>
+            </w:tcMar>
+          </w:tcPr>
+          <w:p>
+            <w:pPr>
+              <w:rPr>
+                <w:color w:val="1F2937"/>
+                <w:sz w:val="19"/>
+                <w:szCs w:val="19"/>
+              </w:rPr>
+            </w:pPr>
+          </w:p>
+        </w:tc>
+        <w:tc>
+          <w:tcPr>
+            <w:tcW w:w="1320" w:type="dxa"/>
+            <w:tcMar>
+              <w:top w:w="90" w:type="dxa"/>
+              <w:left w:w="100" w:type="dxa"/>
+              <w:bottom w:w="90" w:type="dxa"/>
+              <w:right w:w="100" w:type="dxa"/>
+            </w:tcMar>
+          </w:tcPr>
+          <w:p>
+            <w:pPr>
+              <w:rPr>
+                <w:color w:val="1F2937"/>
+                <w:sz w:val="19"/>
+                <w:szCs w:val="19"/>
+              </w:rPr>
+            </w:pPr>
+          </w:p>
+        </w:tc>
+        <w:tc>
+          <w:tcPr>
+            <w:tcW w:w="2110" w:type="dxa"/>
+            <w:tcMar>
+              <w:top w:w="90" w:type="dxa"/>
+              <w:left w:w="100" w:type="dxa"/>
+              <w:bottom w:w="90" w:type="dxa"/>
+              <w:right w:w="100" w:type="dxa"/>
+            </w:tcMar>
+          </w:tcPr>
+          <w:p>
+            <w:pPr>
+              <w:rPr>
+                <w:color w:val="1F2937"/>
+                <w:sz w:val="19"/>
+                <w:szCs w:val="19"/>
+              </w:rPr>
+            </w:pPr>
+          </w:p>
+        </w:tc>
+        <w:tc>
+          <w:tcPr>
+            <w:tcW w:w="1320" w:type="dxa"/>
+            <w:tcMar>
+              <w:top w:w="90" w:type="dxa"/>
+              <w:left w:w="100" w:type="dxa"/>
+              <w:bottom w:w="90" w:type="dxa"/>
+              <w:right w:w="100" w:type="dxa"/>
+            </w:tcMar>
+          </w:tcPr>
+          <w:p>
+            <w:pPr>
+              <w:rPr>
+                <w:color w:val="1F2937"/>
+                <w:sz w:val="19"/>
+                <w:szCs w:val="19"/>
+              </w:rPr>
+            </w:pPr>
+          </w:p>
+        </w:tc>
+      </w:tr>
+      <w:tr>
+        <w:trPr>
+          <w:cantSplit/>
+        </w:trPr>
+        <w:tc>
+          <w:tcPr>
+            <w:tcW w:w="1150" w:type="dxa"/>
+            <w:tcMar>
+              <w:top w:w="90" w:type="dxa"/>
+              <w:left w:w="100" w:type="dxa"/>
+              <w:bottom w:w="90" w:type="dxa"/>
+              <w:right w:w="100" w:type="dxa"/>
+            </w:tcMar>
+          </w:tcPr>
+          <w:p>
+            <w:pPr>
+              <w:rPr>
+                <w:color w:val="1F2937"/>
+                <w:sz w:val="19"/>
+                <w:szCs w:val="19"/>
+              </w:rPr>
+            </w:pPr>
+          </w:p>
+        </w:tc>
+        <w:tc>
+          <w:tcPr>
+            <w:tcW w:w="3460" w:type="dxa"/>
+            <w:tcMar>
+              <w:top w:w="90" w:type="dxa"/>
+              <w:left w:w="100" w:type="dxa"/>
+              <w:bottom w:w="90" w:type="dxa"/>
+              <w:right w:w="100" w:type="dxa"/>
+            </w:tcMar>
+          </w:tcPr>
+          <w:p>
+            <w:pPr>
+              <w:rPr>
+                <w:color w:val="1F2937"/>
+                <w:sz w:val="19"/>
+                <w:szCs w:val="19"/>
+              </w:rPr>
+            </w:pPr>
+          </w:p>
+        </w:tc>
+        <w:tc>
+          <w:tcPr>
+            <w:tcW w:w="1320" w:type="dxa"/>
+            <w:tcMar>
+              <w:top w:w="90" w:type="dxa"/>
+              <w:left w:w="100" w:type="dxa"/>
+              <w:bottom w:w="90" w:type="dxa"/>
+              <w:right w:w="100" w:type="dxa"/>
+            </w:tcMar>
+          </w:tcPr>
+          <w:p>
+            <w:pPr>
+              <w:rPr>
+                <w:color w:val="1F2937"/>
+                <w:sz w:val="19"/>
+                <w:szCs w:val="19"/>
+              </w:rPr>
+            </w:pPr>
+          </w:p>
+        </w:tc>
+        <w:tc>
+          <w:tcPr>
+            <w:tcW w:w="2110" w:type="dxa"/>
+            <w:tcMar>
+              <w:top w:w="90" w:type="dxa"/>
+              <w:left w:w="100" w:type="dxa"/>
+              <w:bottom w:w="90" w:type="dxa"/>
+              <w:right w:w="100" w:type="dxa"/>
+            </w:tcMar>
+          </w:tcPr>
+          <w:p>
+            <w:pPr>
+              <w:rPr>
+                <w:color w:val="1F2937"/>
+                <w:sz w:val="19"/>
+                <w:szCs w:val="19"/>
+              </w:rPr>
+            </w:pPr>
+          </w:p>
+        </w:tc>
+        <w:tc>
+          <w:tcPr>
+            <w:tcW w:w="1320" w:type="dxa"/>
+            <w:tcMar>
+              <w:top w:w="90" w:type="dxa"/>
+              <w:left w:w="100" w:type="dxa"/>
+              <w:bottom w:w="90" w:type="dxa"/>
+              <w:right w:w="100" w:type="dxa"/>
+            </w:tcMar>
+          </w:tcPr>
+          <w:p>
+            <w:pPr>
+              <w:rPr>
+                <w:color w:val="1F2937"/>
+                <w:sz w:val="19"/>
+                <w:szCs w:val="19"/>
+              </w:rPr>
+            </w:pPr>
+          </w:p>
+        </w:tc>
+      </w:tr>
+      <w:tr>
+        <w:trPr>
+          <w:cantSplit/>
+        </w:trPr>
+        <w:tc>
+          <w:tcPr>
+            <w:tcW w:w="1150" w:type="dxa"/>
+            <w:tcMar>
+              <w:top w:w="90" w:type="dxa"/>
+              <w:left w:w="100" w:type="dxa"/>
+              <w:bottom w:w="90" w:type="dxa"/>
+              <w:right w:w="100" w:type="dxa"/>
+            </w:tcMar>
+          </w:tcPr>
+          <w:p>
+            <w:pPr>
+              <w:rPr>
+                <w:color w:val="1F2937"/>
+                <w:sz w:val="19"/>
+                <w:szCs w:val="19"/>
+              </w:rPr>
+            </w:pPr>
+          </w:p>
+        </w:tc>
+        <w:tc>
+          <w:tcPr>
+            <w:tcW w:w="3460" w:type="dxa"/>
+            <w:tcMar>
+              <w:top w:w="90" w:type="dxa"/>
+              <w:left w:w="100" w:type="dxa"/>
+              <w:bottom w:w="90" w:type="dxa"/>
+              <w:right w:w="100" w:type="dxa"/>
+            </w:tcMar>
+          </w:tcPr>
+          <w:p>
+            <w:pPr>
+              <w:rPr>
+                <w:color w:val="1F2937"/>
+                <w:sz w:val="19"/>
+                <w:szCs w:val="19"/>
+              </w:rPr>
+            </w:pPr>
+          </w:p>
+        </w:tc>
+        <w:tc>
+          <w:tcPr>
+            <w:tcW w:w="1320" w:type="dxa"/>
+            <w:tcMar>
+              <w:top w:w="90" w:type="dxa"/>
+              <w:left w:w="100" w:type="dxa"/>
+              <w:bottom w:w="90" w:type="dxa"/>
+              <w:right w:w="100" w:type="dxa"/>
+            </w:tcMar>
+          </w:tcPr>
+          <w:p>
+            <w:pPr>
+              <w:rPr>
+                <w:color w:val="1F2937"/>
+                <w:sz w:val="19"/>
+                <w:szCs w:val="19"/>
+              </w:rPr>
+            </w:pPr>
+          </w:p>
+        </w:tc>
+        <w:tc>
+          <w:tcPr>
+            <w:tcW w:w="2110" w:type="dxa"/>
+            <w:tcMar>
+              <w:top w:w="90" w:type="dxa"/>
+              <w:left w:w="100" w:type="dxa"/>
+              <w:bottom w:w="90" w:type="dxa"/>
+              <w:right w:w="100" w:type="dxa"/>
+            </w:tcMar>
+          </w:tcPr>
+          <w:p>
+            <w:pPr>
+              <w:rPr>
+                <w:color w:val="1F2937"/>
+                <w:sz w:val="19"/>
+                <w:szCs w:val="19"/>
+              </w:rPr>
+            </w:pPr>
+          </w:p>
+        </w:tc>
+        <w:tc>
+          <w:tcPr>
+            <w:tcW w:w="1320" w:type="dxa"/>
+            <w:tcMar>
+              <w:top w:w="90" w:type="dxa"/>
+              <w:left w:w="100" w:type="dxa"/>
+              <w:bottom w:w="90" w:type="dxa"/>
+              <w:right w:w="100" w:type="dxa"/>
+            </w:tcMar>
+          </w:tcPr>
+          <w:p>
+            <w:pPr>
+              <w:rPr>
+                <w:color w:val="1F2937"/>
+                <w:sz w:val="19"/>
+                <w:szCs w:val="19"/>
+              </w:rPr>
+            </w:pPr>
+          </w:p>
+        </w:tc>
+      </w:tr>
+      <w:tr>
+        <w:trPr>
+          <w:cantSplit/>
+        </w:trPr>
+        <w:tc>
+          <w:tcPr>
+            <w:tcW w:w="1150" w:type="dxa"/>
+            <w:tcMar>
+              <w:top w:w="90" w:type="dxa"/>
+              <w:left w:w="100" w:type="dxa"/>
+              <w:bottom w:w="90" w:type="dxa"/>
+              <w:right w:w="100" w:type="dxa"/>
+            </w:tcMar>
+          </w:tcPr>
+          <w:p>
+            <w:pPr>
+              <w:rPr>
+                <w:color w:val="1F2937"/>
+                <w:sz w:val="19"/>
+                <w:szCs w:val="19"/>
+              </w:rPr>
+            </w:pPr>
+          </w:p>
+        </w:tc>
+        <w:tc>
+          <w:tcPr>
+            <w:tcW w:w="3460" w:type="dxa"/>
+            <w:tcMar>
+              <w:top w:w="90" w:type="dxa"/>
+              <w:left w:w="100" w:type="dxa"/>
+              <w:bottom w:w="90" w:type="dxa"/>
+              <w:right w:w="100" w:type="dxa"/>
+            </w:tcMar>
+          </w:tcPr>
+          <w:p>
+            <w:pPr>
+              <w:rPr>
+                <w:color w:val="1F2937"/>
+                <w:sz w:val="19"/>
+                <w:szCs w:val="19"/>
+              </w:rPr>
+            </w:pPr>
+          </w:p>
+        </w:tc>
+        <w:tc>
+          <w:tcPr>
+            <w:tcW w:w="1320" w:type="dxa"/>
+            <w:tcMar>
+              <w:top w:w="90" w:type="dxa"/>
+              <w:left w:w="100" w:type="dxa"/>
+              <w:bottom w:w="90" w:type="dxa"/>
+              <w:right w:w="100" w:type="dxa"/>
+            </w:tcMar>
+          </w:tcPr>
+          <w:p>
+            <w:pPr>
+              <w:rPr>
+                <w:color w:val="1F2937"/>
+                <w:sz w:val="19"/>
+                <w:szCs w:val="19"/>
+              </w:rPr>
+            </w:pPr>
+          </w:p>
+        </w:tc>
+        <w:tc>
+          <w:tcPr>
+            <w:tcW w:w="2110" w:type="dxa"/>
+            <w:tcMar>
+              <w:top w:w="90" w:type="dxa"/>
+              <w:left w:w="100" w:type="dxa"/>
+              <w:bottom w:w="90" w:type="dxa"/>
+              <w:right w:w="100" w:type="dxa"/>
+            </w:tcMar>
+          </w:tcPr>
+          <w:p>
+            <w:pPr>
+              <w:rPr>
+                <w:color w:val="1F2937"/>
+                <w:sz w:val="19"/>
+                <w:szCs w:val="19"/>
+              </w:rPr>
+            </w:pPr>
+          </w:p>
+        </w:tc>
+        <w:tc>
+          <w:tcPr>
+            <w:tcW w:w="1320" w:type="dxa"/>
+            <w:tcMar>
+              <w:top w:w="90" w:type="dxa"/>
+              <w:left w:w="100" w:type="dxa"/>
+              <w:bottom w:w="90" w:type="dxa"/>
+              <w:right w:w="100" w:type="dxa"/>
+            </w:tcMar>
+          </w:tcPr>
+          <w:p>
+            <w:pPr>
+              <w:rPr>
+                <w:color w:val="1F2937"/>
+                <w:sz w:val="19"/>
+                <w:szCs w:val="19"/>
+              </w:rPr>
+            </w:pPr>
+          </w:p>
+        </w:tc>
+      </w:tr>
+      <w:tr>
+        <w:trPr>
+          <w:cantSplit/>
+        </w:trPr>
+        <w:tc>
+          <w:tcPr>
+            <w:tcW w:w="1150" w:type="dxa"/>
+            <w:tcMar>
+              <w:top w:w="90" w:type="dxa"/>
+              <w:left w:w="100" w:type="dxa"/>
+              <w:bottom w:w="90" w:type="dxa"/>
+              <w:right w:w="100" w:type="dxa"/>
+            </w:tcMar>
+          </w:tcPr>
+          <w:p>
+            <w:pPr>
+              <w:rPr>
+                <w:color w:val="1F2937"/>
+                <w:sz w:val="19"/>
+                <w:szCs w:val="19"/>
+              </w:rPr>
+            </w:pPr>
+          </w:p>
+        </w:tc>
+        <w:tc>
+          <w:tcPr>
+            <w:tcW w:w="3460" w:type="dxa"/>
+            <w:tcMar>
+              <w:top w:w="90" w:type="dxa"/>
+              <w:left w:w="100" w:type="dxa"/>
+              <w:bottom w:w="90" w:type="dxa"/>
+              <w:right w:w="100" w:type="dxa"/>
+            </w:tcMar>
+          </w:tcPr>
+          <w:p>
+            <w:pPr>
+              <w:rPr>
+                <w:color w:val="1F2937"/>
+                <w:sz w:val="19"/>
+                <w:szCs w:val="19"/>
+              </w:rPr>
+            </w:pPr>
+          </w:p>
+        </w:tc>
+        <w:tc>
+          <w:tcPr>
+            <w:tcW w:w="1320" w:type="dxa"/>
+            <w:tcMar>
+              <w:top w:w="90" w:type="dxa"/>
+              <w:left w:w="100" w:type="dxa"/>
+              <w:bottom w:w="90" w:type="dxa"/>
+              <w:right w:w="100" w:type="dxa"/>
+            </w:tcMar>
+          </w:tcPr>
+          <w:p>
+            <w:pPr>
+              <w:rPr>
+                <w:color w:val="1F2937"/>
+                <w:sz w:val="19"/>
+                <w:szCs w:val="19"/>
+              </w:rPr>
+            </w:pPr>
+          </w:p>
+        </w:tc>
+        <w:tc>
+          <w:tcPr>
+            <w:tcW w:w="2110" w:type="dxa"/>
+            <w:tcMar>
+              <w:top w:w="90" w:type="dxa"/>
+              <w:left w:w="100" w:type="dxa"/>
+              <w:bottom w:w="90" w:type="dxa"/>
+              <w:right w:w="100" w:type="dxa"/>
+            </w:tcMar>
+          </w:tcPr>
+          <w:p>
+            <w:pPr>
+              <w:rPr>
+                <w:color w:val="1F2937"/>
+                <w:sz w:val="19"/>
+                <w:szCs w:val="19"/>
+              </w:rPr>
+            </w:pPr>
+          </w:p>
+        </w:tc>
+        <w:tc>
+          <w:tcPr>
+            <w:tcW w:w="1320" w:type="dxa"/>
+            <w:tcMar>
+              <w:top w:w="90" w:type="dxa"/>
+              <w:left w:w="100" w:type="dxa"/>
+              <w:bottom w:w="90" w:type="dxa"/>
+              <w:right w:w="100" w:type="dxa"/>
+            </w:tcMar>
+          </w:tcPr>
+          <w:p>
+            <w:pPr>
+              <w:rPr>
+                <w:color w:val="1F2937"/>
+                <w:sz w:val="19"/>
+                <w:szCs w:val="19"/>
+              </w:rPr>
+            </w:pPr>
+          </w:p>
+        </w:tc>
+      </w:tr>
+      <w:tr>
+        <w:trPr>
+          <w:cantSplit/>
+        </w:trPr>
+        <w:tc>
+          <w:tcPr>
+            <w:tcW w:w="1150" w:type="dxa"/>
+            <w:tcMar>
+              <w:top w:w="90" w:type="dxa"/>
+              <w:left w:w="100" w:type="dxa"/>
+              <w:bottom w:w="90" w:type="dxa"/>
+              <w:right w:w="100" w:type="dxa"/>
+            </w:tcMar>
+          </w:tcPr>
+          <w:p>
+            <w:pPr>
+              <w:rPr>
+                <w:color w:val="1F2937"/>
+                <w:sz w:val="19"/>
+                <w:szCs w:val="19"/>
+              </w:rPr>
+            </w:pPr>
+          </w:p>
+        </w:tc>
+        <w:tc>
+          <w:tcPr>
+            <w:tcW w:w="3460" w:type="dxa"/>
+            <w:tcMar>
+              <w:top w:w="90" w:type="dxa"/>
+              <w:left w:w="100" w:type="dxa"/>
+              <w:bottom w:w="90" w:type="dxa"/>
+              <w:right w:w="100" w:type="dxa"/>
+            </w:tcMar>
+          </w:tcPr>
+          <w:p>
+            <w:pPr>
+              <w:rPr>
+                <w:color w:val="1F2937"/>
+                <w:sz w:val="19"/>
+                <w:szCs w:val="19"/>
+              </w:rPr>
+            </w:pPr>
+          </w:p>
+        </w:tc>
+        <w:tc>
+          <w:tcPr>
+            <w:tcW w:w="1320" w:type="dxa"/>
+            <w:tcMar>
+              <w:top w:w="90" w:type="dxa"/>
+              <w:left w:w="100" w:type="dxa"/>
+              <w:bottom w:w="90" w:type="dxa"/>
+              <w:right w:w="100" w:type="dxa"/>
+            </w:tcMar>
+          </w:tcPr>
+          <w:p>
+            <w:pPr>
+              <w:rPr>
+                <w:color w:val="1F2937"/>
+                <w:sz w:val="19"/>
+                <w:szCs w:val="19"/>
+              </w:rPr>
+            </w:pPr>
+          </w:p>
+        </w:tc>
+        <w:tc>
+          <w:tcPr>
+            <w:tcW w:w="2110" w:type="dxa"/>
+            <w:tcMar>
+              <w:top w:w="90" w:type="dxa"/>
+              <w:left w:w="100" w:type="dxa"/>
+              <w:bottom w:w="90" w:type="dxa"/>
+              <w:right w:w="100" w:type="dxa"/>
+            </w:tcMar>
+          </w:tcPr>
+          <w:p>
+            <w:pPr>
+              <w:rPr>
+                <w:color w:val="1F2937"/>
+                <w:sz w:val="19"/>
+                <w:szCs w:val="19"/>
+              </w:rPr>
+            </w:pPr>
+          </w:p>
+        </w:tc>
+        <w:tc>
+          <w:tcPr>
+            <w:tcW w:w="1320" w:type="dxa"/>
+            <w:tcMar>
+              <w:top w:w="90" w:type="dxa"/>
+              <w:left w:w="100" w:type="dxa"/>
+              <w:bottom w:w="90" w:type="dxa"/>
+              <w:right w:w="100" w:type="dxa"/>
+            </w:tcMar>
+          </w:tcPr>
+          <w:p>
+            <w:pPr>
+              <w:rPr>
+                <w:color w:val="1F2937"/>
+                <w:sz w:val="19"/>
+                <w:szCs w:val="19"/>
+              </w:rPr>
+            </w:pPr>
+          </w:p>
+        </w:tc>
+      </w:tr>
+      <w:tr>
+        <w:trPr>
+          <w:cantSplit/>
+        </w:trPr>
+        <w:tc>
+          <w:tcPr>
+            <w:tcW w:w="1150" w:type="dxa"/>
+            <w:tcMar>
+              <w:top w:w="90" w:type="dxa"/>
+              <w:left w:w="100" w:type="dxa"/>
+              <w:bottom w:w="90" w:type="dxa"/>
+              <w:right w:w="100" w:type="dxa"/>
+            </w:tcMar>
+          </w:tcPr>
+          <w:p>
+            <w:pPr>
+              <w:rPr>
+                <w:color w:val="1F2937"/>
+                <w:sz w:val="19"/>
+                <w:szCs w:val="19"/>
+              </w:rPr>
+            </w:pPr>
+          </w:p>
+        </w:tc>
+        <w:tc>
+          <w:tcPr>
+            <w:tcW w:w="3460" w:type="dxa"/>
+            <w:tcMar>
+              <w:top w:w="90" w:type="dxa"/>
+              <w:left w:w="100" w:type="dxa"/>
+              <w:bottom w:w="90" w:type="dxa"/>
+              <w:right w:w="100" w:type="dxa"/>
+            </w:tcMar>
+          </w:tcPr>
+          <w:p>
+            <w:pPr>
+              <w:rPr>
+                <w:color w:val="1F2937"/>
+                <w:sz w:val="19"/>
+                <w:szCs w:val="19"/>
+              </w:rPr>
+            </w:pPr>
+          </w:p>
+        </w:tc>
+        <w:tc>
+          <w:tcPr>
+            <w:tcW w:w="1320" w:type="dxa"/>
+            <w:tcMar>
+              <w:top w:w="90" w:type="dxa"/>
+              <w:left w:w="100" w:type="dxa"/>
+              <w:bottom w:w="90" w:type="dxa"/>
+              <w:right w:w="100" w:type="dxa"/>
+            </w:tcMar>
+          </w:tcPr>
+          <w:p>
+            <w:pPr>
+              <w:rPr>
+                <w:color w:val="1F2937"/>
+                <w:sz w:val="19"/>
+                <w:szCs w:val="19"/>
+              </w:rPr>
+            </w:pPr>
+          </w:p>
+        </w:tc>
+        <w:tc>
+          <w:tcPr>
+            <w:tcW w:w="2110" w:type="dxa"/>
+            <w:tcMar>
+              <w:top w:w="90" w:type="dxa"/>
+              <w:left w:w="100" w:type="dxa"/>
+              <w:bottom w:w="90" w:type="dxa"/>
+              <w:right w:w="100" w:type="dxa"/>
+            </w:tcMar>
+          </w:tcPr>
+          <w:p>
+            <w:pPr>
+              <w:rPr>
+                <w:color w:val="1F2937"/>
+                <w:sz w:val="19"/>
+                <w:szCs w:val="19"/>
+              </w:rPr>
+            </w:pPr>
+          </w:p>
+        </w:tc>
+        <w:tc>
+          <w:tcPr>
+            <w:tcW w:w="1320" w:type="dxa"/>
+            <w:tcMar>
+              <w:top w:w="90" w:type="dxa"/>
+              <w:left w:w="100" w:type="dxa"/>
+              <w:bottom w:w="90" w:type="dxa"/>
+              <w:right w:w="100" w:type="dxa"/>
+            </w:tcMar>
+          </w:tcPr>
+          <w:p>
+            <w:pPr>
+              <w:rPr>
+                <w:color w:val="1F2937"/>
+                <w:sz w:val="19"/>
+                <w:szCs w:val="19"/>
+              </w:rPr>
+            </w:pPr>
+          </w:p>
+        </w:tc>
+      </w:tr>
+      <w:tr>
+        <w:trPr>
+          <w:cantSplit/>
+        </w:trPr>
+        <w:tc>
+          <w:tcPr>
+            <w:tcW w:w="1150" w:type="dxa"/>
+            <w:tcMar>
+              <w:top w:w="90" w:type="dxa"/>
+              <w:left w:w="100" w:type="dxa"/>
+              <w:bottom w:w="90" w:type="dxa"/>
+              <w:right w:w="100" w:type="dxa"/>
+            </w:tcMar>
+          </w:tcPr>
+          <w:p>
+            <w:pPr>
+              <w:rPr>
+                <w:color w:val="1F2937"/>
+                <w:sz w:val="19"/>
+                <w:szCs w:val="19"/>
+              </w:rPr>
+            </w:pPr>
+          </w:p>
+        </w:tc>
+        <w:tc>
+          <w:tcPr>
+            <w:tcW w:w="3460" w:type="dxa"/>
+            <w:tcMar>
+              <w:top w:w="90" w:type="dxa"/>
+              <w:left w:w="100" w:type="dxa"/>
+              <w:bottom w:w="90" w:type="dxa"/>
+              <w:right w:w="100" w:type="dxa"/>
+            </w:tcMar>
+          </w:tcPr>
+          <w:p>
+            <w:pPr>
+              <w:rPr>
+                <w:color w:val="1F2937"/>
+                <w:sz w:val="19"/>
+                <w:szCs w:val="19"/>
+              </w:rPr>
+            </w:pPr>
+          </w:p>
+        </w:tc>
+        <w:tc>
+          <w:tcPr>
+            <w:tcW w:w="1320" w:type="dxa"/>
+            <w:tcMar>
+              <w:top w:w="90" w:type="dxa"/>
+              <w:left w:w="100" w:type="dxa"/>
+              <w:bottom w:w="90" w:type="dxa"/>
+              <w:right w:w="100" w:type="dxa"/>
+            </w:tcMar>
+          </w:tcPr>
+          <w:p>
+            <w:pPr>
+              <w:rPr>
+                <w:color w:val="1F2937"/>
+                <w:sz w:val="19"/>
+                <w:szCs w:val="19"/>
+              </w:rPr>
+            </w:pPr>
+          </w:p>
+        </w:tc>
+        <w:tc>
+          <w:tcPr>
+            <w:tcW w:w="2110" w:type="dxa"/>
+            <w:tcMar>
+              <w:top w:w="90" w:type="dxa"/>
+              <w:left w:w="100" w:type="dxa"/>
+              <w:bottom w:w="90" w:type="dxa"/>
+              <w:right w:w="100" w:type="dxa"/>
+            </w:tcMar>
+          </w:tcPr>
+          <w:p>
+            <w:pPr>
+              <w:rPr>
+                <w:color w:val="1F2937"/>
+                <w:sz w:val="19"/>
+                <w:szCs w:val="19"/>
+              </w:rPr>
+            </w:pPr>
+          </w:p>
+        </w:tc>
+        <w:tc>
+          <w:tcPr>
+            <w:tcW w:w="1320" w:type="dxa"/>
+            <w:tcMar>
+              <w:top w:w="90" w:type="dxa"/>
+              <w:left w:w="100" w:type="dxa"/>
+              <w:bottom w:w="90" w:type="dxa"/>
+              <w:right w:w="100" w:type="dxa"/>
+            </w:tcMar>
+          </w:tcPr>
+          <w:p>
+            <w:pPr>
+              <w:rPr>
+                <w:color w:val="1F2937"/>
+                <w:sz w:val="19"/>
+                <w:szCs w:val="19"/>
+              </w:rPr>
+            </w:pPr>
+          </w:p>
+        </w:tc>
+      </w:tr>
+      <w:tr>
+        <w:trPr>
+          <w:cantSplit/>
+        </w:trPr>
+        <w:tc>
+          <w:tcPr>
+            <w:tcW w:w="1150" w:type="dxa"/>
+            <w:tcMar>
+              <w:top w:w="90" w:type="dxa"/>
+              <w:left w:w="100" w:type="dxa"/>
+              <w:bottom w:w="90" w:type="dxa"/>
+              <w:right w:w="100" w:type="dxa"/>
+            </w:tcMar>
+          </w:tcPr>
+          <w:p>
+            <w:pPr>
+              <w:rPr>
+                <w:color w:val="1F2937"/>
+                <w:sz w:val="19"/>
+                <w:szCs w:val="19"/>
+              </w:rPr>
+            </w:pPr>
+          </w:p>
+        </w:tc>
+        <w:tc>
+          <w:tcPr>
+            <w:tcW w:w="3460" w:type="dxa"/>
+            <w:tcMar>
+              <w:top w:w="90" w:type="dxa"/>
+              <w:left w:w="100" w:type="dxa"/>
+              <w:bottom w:w="90" w:type="dxa"/>
+              <w:right w:w="100" w:type="dxa"/>
+            </w:tcMar>
+          </w:tcPr>
+          <w:p>
+            <w:pPr>
+              <w:rPr>
+                <w:color w:val="1F2937"/>
+                <w:sz w:val="19"/>
+                <w:szCs w:val="19"/>
+              </w:rPr>
+            </w:pPr>
+          </w:p>
+        </w:tc>
+        <w:tc>
+          <w:tcPr>
+            <w:tcW w:w="1320" w:type="dxa"/>
+            <w:tcMar>
+              <w:top w:w="90" w:type="dxa"/>
+              <w:left w:w="100" w:type="dxa"/>
+              <w:bottom w:w="90" w:type="dxa"/>
+              <w:right w:w="100" w:type="dxa"/>
+            </w:tcMar>
+          </w:tcPr>
+          <w:p>
+            <w:pPr>
+              <w:rPr>
+                <w:color w:val="1F2937"/>
+                <w:sz w:val="19"/>
+                <w:szCs w:val="19"/>
+              </w:rPr>
+            </w:pPr>
+          </w:p>
+        </w:tc>
+        <w:tc>
+          <w:tcPr>
+            <w:tcW w:w="2110" w:type="dxa"/>
+            <w:tcMar>
+              <w:top w:w="90" w:type="dxa"/>
+              <w:left w:w="100" w:type="dxa"/>
+              <w:bottom w:w="90" w:type="dxa"/>
+              <w:right w:w="100" w:type="dxa"/>
+            </w:tcMar>
+          </w:tcPr>
+          <w:p>
+            <w:pPr>
+              <w:rPr>
+                <w:color w:val="1F2937"/>
+                <w:sz w:val="19"/>
+                <w:szCs w:val="19"/>
+              </w:rPr>
+            </w:pPr>
+          </w:p>
+        </w:tc>
+        <w:tc>
+          <w:tcPr>
+            <w:tcW w:w="1320" w:type="dxa"/>
+            <w:tcMar>
+              <w:top w:w="90" w:type="dxa"/>
+              <w:left w:w="100" w:type="dxa"/>
+              <w:bottom w:w="90" w:type="dxa"/>
+              <w:right w:w="100" w:type="dxa"/>
+            </w:tcMar>
+          </w:tcPr>
+          <w:p>
+            <w:pPr>
+              <w:rPr>
+                <w:color w:val="1F2937"/>
+                <w:sz w:val="19"/>
+                <w:szCs w:val="19"/>
+              </w:rPr>
+            </w:pPr>
+          </w:p>
+        </w:tc>
+      </w:tr>
+      <w:tr>
+        <w:trPr>
+          <w:cantSplit/>
+        </w:trPr>
+        <w:tc>
+          <w:tcPr>
+            <w:tcW w:w="1150" w:type="dxa"/>
+            <w:tcMar>
+              <w:top w:w="90" w:type="dxa"/>
+              <w:left w:w="100" w:type="dxa"/>
+              <w:bottom w:w="90" w:type="dxa"/>
+              <w:right w:w="100" w:type="dxa"/>
+            </w:tcMar>
+          </w:tcPr>
+          <w:p>
+            <w:pPr>
+              <w:rPr>
+                <w:color w:val="1F2937"/>
+                <w:sz w:val="19"/>
+                <w:szCs w:val="19"/>
+              </w:rPr>
+            </w:pPr>
+          </w:p>
+        </w:tc>
+        <w:tc>
+          <w:tcPr>
+            <w:tcW w:w="3460" w:type="dxa"/>
+            <w:tcMar>
+              <w:top w:w="90" w:type="dxa"/>
+              <w:left w:w="100" w:type="dxa"/>
+              <w:bottom w:w="90" w:type="dxa"/>
+              <w:right w:w="100" w:type="dxa"/>
+            </w:tcMar>
+          </w:tcPr>
+          <w:p>
+            <w:pPr>
+              <w:rPr>
+                <w:color w:val="1F2937"/>
+                <w:sz w:val="19"/>
+                <w:szCs w:val="19"/>
+              </w:rPr>
+            </w:pPr>
+          </w:p>
+        </w:tc>
+        <w:tc>
+          <w:tcPr>
+            <w:tcW w:w="1320" w:type="dxa"/>
+            <w:tcMar>
+              <w:top w:w="90" w:type="dxa"/>
+              <w:left w:w="100" w:type="dxa"/>
+              <w:bottom w:w="90" w:type="dxa"/>
+              <w:right w:w="100" w:type="dxa"/>
+            </w:tcMar>
+          </w:tcPr>
+          <w:p>
+            <w:pPr>
+              <w:rPr>
+                <w:color w:val="1F2937"/>
+                <w:sz w:val="19"/>
+                <w:szCs w:val="19"/>
+              </w:rPr>
+            </w:pPr>
+          </w:p>
+        </w:tc>
+        <w:tc>
+          <w:tcPr>
+            <w:tcW w:w="2110" w:type="dxa"/>
+            <w:tcMar>
+              <w:top w:w="90" w:type="dxa"/>
+              <w:left w:w="100" w:type="dxa"/>
+              <w:bottom w:w="90" w:type="dxa"/>
+              <w:right w:w="100" w:type="dxa"/>
+            </w:tcMar>
+          </w:tcPr>
+          <w:p>
+            <w:pPr>
+              <w:rPr>
+                <w:color w:val="1F2937"/>
+                <w:sz w:val="19"/>
+                <w:szCs w:val="19"/>
+              </w:rPr>
+            </w:pPr>
+          </w:p>
+        </w:tc>
+        <w:tc>
+          <w:tcPr>
+            <w:tcW w:w="1320" w:type="dxa"/>
+            <w:tcMar>
+              <w:top w:w="90" w:type="dxa"/>
+              <w:left w:w="100" w:type="dxa"/>
+              <w:bottom w:w="90" w:type="dxa"/>
+              <w:right w:w="100" w:type="dxa"/>
+            </w:tcMar>
+          </w:tcPr>
+          <w:p>
+            <w:pPr>
+              <w:rPr>
+                <w:color w:val="1F2937"/>
+                <w:sz w:val="19"/>
+                <w:szCs w:val="19"/>
+              </w:rPr>
+            </w:pPr>
+          </w:p>
+        </w:tc>
+      </w:tr>
+      <w:tr>
+        <w:trPr>
+          <w:cantSplit/>
+        </w:trPr>
+        <w:tc>
+          <w:tcPr>
+            <w:tcW w:w="1150" w:type="dxa"/>
+            <w:tcMar>
+              <w:top w:w="90" w:type="dxa"/>
+              <w:left w:w="100" w:type="dxa"/>
+              <w:bottom w:w="90" w:type="dxa"/>
+              <w:right w:w="100" w:type="dxa"/>
+            </w:tcMar>
+          </w:tcPr>
+          <w:p>
+            <w:pPr>
+              <w:rPr>
+                <w:color w:val="1F2937"/>
+                <w:sz w:val="19"/>
+                <w:szCs w:val="19"/>
+              </w:rPr>
+            </w:pPr>
+          </w:p>
+        </w:tc>
+        <w:tc>
+          <w:tcPr>
+            <w:tcW w:w="3460" w:type="dxa"/>
+            <w:tcMar>
+              <w:top w:w="90" w:type="dxa"/>
+              <w:left w:w="100" w:type="dxa"/>
+              <w:bottom w:w="90" w:type="dxa"/>
+              <w:right w:w="100" w:type="dxa"/>
+            </w:tcMar>
+          </w:tcPr>
+          <w:p>
+            <w:pPr>
+              <w:rPr>
+                <w:color w:val="1F2937"/>
+                <w:sz w:val="19"/>
+                <w:szCs w:val="19"/>
+              </w:rPr>
+            </w:pPr>
+          </w:p>
+        </w:tc>
+        <w:tc>
+          <w:tcPr>
+            <w:tcW w:w="1320" w:type="dxa"/>
+            <w:tcMar>
+              <w:top w:w="90" w:type="dxa"/>
+              <w:left w:w="100" w:type="dxa"/>
+              <w:bottom w:w="90" w:type="dxa"/>
+              <w:right w:w="100" w:type="dxa"/>
+            </w:tcMar>
+          </w:tcPr>
+          <w:p>
+            <w:pPr>
+              <w:rPr>
+                <w:color w:val="1F2937"/>
+                <w:sz w:val="19"/>
+                <w:szCs w:val="19"/>
+              </w:rPr>
+            </w:pPr>
+          </w:p>
+        </w:tc>
+        <w:tc>
+          <w:tcPr>
+            <w:tcW w:w="2110" w:type="dxa"/>
+            <w:tcMar>
+              <w:top w:w="90" w:type="dxa"/>
+              <w:left w:w="100" w:type="dxa"/>
+              <w:bottom w:w="90" w:type="dxa"/>
+              <w:right w:w="100" w:type="dxa"/>
+            </w:tcMar>
+          </w:tcPr>
+          <w:p>
+            <w:pPr>
+              <w:rPr>
+                <w:color w:val="1F2937"/>
+                <w:sz w:val="19"/>
+                <w:szCs w:val="19"/>
+              </w:rPr>
+            </w:pPr>
+          </w:p>
+        </w:tc>
+        <w:tc>
+          <w:tcPr>
+            <w:tcW w:w="1320" w:type="dxa"/>
+            <w:tcMar>
+              <w:top w:w="90" w:type="dxa"/>
+              <w:left w:w="100" w:type="dxa"/>
+              <w:bottom w:w="90" w:type="dxa"/>
+              <w:right w:w="100" w:type="dxa"/>
+            </w:tcMar>
+          </w:tcPr>
+          <w:p>
+            <w:pPr>
+              <w:rPr>
+                <w:color w:val="1F2937"/>
+                <w:sz w:val="19"/>
+                <w:szCs w:val="19"/>
+              </w:rPr>
+            </w:pPr>
+          </w:p>
+        </w:tc>
+      </w:tr>
+      <w:tr>
+        <w:trPr>
+          <w:cantSplit/>
+        </w:trPr>
+        <w:tc>
+          <w:tcPr>
+            <w:tcW w:w="1150" w:type="dxa"/>
+            <w:tcMar>
+              <w:top w:w="90" w:type="dxa"/>
+              <w:left w:w="100" w:type="dxa"/>
+              <w:bottom w:w="90" w:type="dxa"/>
+              <w:right w:w="100" w:type="dxa"/>
+            </w:tcMar>
+          </w:tcPr>
+          <w:p>
+            <w:pPr>
+              <w:rPr>
+                <w:color w:val="1F2937"/>
+                <w:sz w:val="19"/>
+                <w:szCs w:val="19"/>
+              </w:rPr>
+            </w:pPr>
+          </w:p>
+        </w:tc>
+        <w:tc>
+          <w:tcPr>
+            <w:tcW w:w="3460" w:type="dxa"/>
+            <w:tcMar>
+              <w:top w:w="90" w:type="dxa"/>
+              <w:left w:w="100" w:type="dxa"/>
+              <w:bottom w:w="90" w:type="dxa"/>
+              <w:right w:w="100" w:type="dxa"/>
+            </w:tcMar>
+          </w:tcPr>
+          <w:p>
+            <w:pPr>
+              <w:rPr>
+                <w:color w:val="1F2937"/>
+                <w:sz w:val="19"/>
+                <w:szCs w:val="19"/>
+              </w:rPr>
+            </w:pPr>
+          </w:p>
+        </w:tc>
+        <w:tc>
+          <w:tcPr>
+            <w:tcW w:w="1320" w:type="dxa"/>
+            <w:tcMar>
+              <w:top w:w="90" w:type="dxa"/>
+              <w:left w:w="100" w:type="dxa"/>
+              <w:bottom w:w="90" w:type="dxa"/>
+              <w:right w:w="100" w:type="dxa"/>
+            </w:tcMar>
+          </w:tcPr>
+          <w:p>
+            <w:pPr>
+              <w:rPr>
+                <w:color w:val="1F2937"/>
+                <w:sz w:val="19"/>
+                <w:szCs w:val="19"/>
+              </w:rPr>
+            </w:pPr>
+          </w:p>
+        </w:tc>
+        <w:tc>
+          <w:tcPr>
+            <w:tcW w:w="2110" w:type="dxa"/>
+            <w:tcMar>
+              <w:top w:w="90" w:type="dxa"/>
+              <w:left w:w="100" w:type="dxa"/>
+              <w:bottom w:w="90" w:type="dxa"/>
+              <w:right w:w="100" w:type="dxa"/>
+            </w:tcMar>
+          </w:tcPr>
+          <w:p>
+            <w:pPr>
+              <w:rPr>
+                <w:color w:val="1F2937"/>
+                <w:sz w:val="19"/>
+                <w:szCs w:val="19"/>
+              </w:rPr>
+            </w:pPr>
+          </w:p>
+        </w:tc>
+        <w:tc>
+          <w:tcPr>
+            <w:tcW w:w="1320" w:type="dxa"/>
+            <w:tcMar>
+              <w:top w:w="90" w:type="dxa"/>
+              <w:left w:w="100" w:type="dxa"/>
+              <w:bottom w:w="90" w:type="dxa"/>
+              <w:right w:w="100" w:type="dxa"/>
+            </w:tcMar>
+          </w:tcPr>
+          <w:p>
+            <w:pPr>
+              <w:rPr>
+                <w:color w:val="1F2937"/>
+                <w:sz w:val="19"/>
+                <w:szCs w:val="19"/>
+              </w:rPr>
+            </w:pPr>
+          </w:p>
+        </w:tc>
+      </w:tr>
+      <w:tr>
+        <w:trPr>
+          <w:cantSplit/>
+        </w:trPr>
+        <w:tc>
+          <w:tcPr>
+            <w:tcW w:w="1150" w:type="dxa"/>
+            <w:tcMar>
+              <w:top w:w="90" w:type="dxa"/>
+              <w:left w:w="100" w:type="dxa"/>
+              <w:bottom w:w="90" w:type="dxa"/>
+              <w:right w:w="100" w:type="dxa"/>
+            </w:tcMar>
+          </w:tcPr>
+          <w:p>
+            <w:pPr>
+              <w:rPr>
+                <w:color w:val="1F2937"/>
+                <w:sz w:val="19"/>
+                <w:szCs w:val="19"/>
+              </w:rPr>
+            </w:pPr>
+          </w:p>
+        </w:tc>
+        <w:tc>
+          <w:tcPr>
+            <w:tcW w:w="3460" w:type="dxa"/>
+            <w:tcMar>
+              <w:top w:w="90" w:type="dxa"/>
+              <w:left w:w="100" w:type="dxa"/>
+              <w:bottom w:w="90" w:type="dxa"/>
+              <w:right w:w="100" w:type="dxa"/>
+            </w:tcMar>
+          </w:tcPr>
+          <w:p>
+            <w:pPr>
+              <w:rPr>
+                <w:color w:val="1F2937"/>
+                <w:sz w:val="19"/>
+                <w:szCs w:val="19"/>
+              </w:rPr>
+            </w:pPr>
+          </w:p>
+        </w:tc>
+        <w:tc>
+          <w:tcPr>
+            <w:tcW w:w="1320" w:type="dxa"/>
+            <w:tcMar>
+              <w:top w:w="90" w:type="dxa"/>
+              <w:left w:w="100" w:type="dxa"/>
+              <w:bottom w:w="90" w:type="dxa"/>
+              <w:right w:w="100" w:type="dxa"/>
+            </w:tcMar>
+          </w:tcPr>
+          <w:p>
+            <w:pPr>
+              <w:rPr>
+                <w:color w:val="1F2937"/>
+                <w:sz w:val="19"/>
+                <w:szCs w:val="19"/>
+              </w:rPr>
+            </w:pPr>
+          </w:p>
+        </w:tc>
+        <w:tc>
+          <w:tcPr>
+            <w:tcW w:w="2110" w:type="dxa"/>
+            <w:tcMar>
+              <w:top w:w="90" w:type="dxa"/>
+              <w:left w:w="100" w:type="dxa"/>
+              <w:bottom w:w="90" w:type="dxa"/>
+              <w:right w:w="100" w:type="dxa"/>
+            </w:tcMar>
+          </w:tcPr>
+          <w:p>
+            <w:pPr>
+              <w:rPr>
+                <w:color w:val="1F2937"/>
+                <w:sz w:val="19"/>
+                <w:szCs w:val="19"/>
+              </w:rPr>
+            </w:pPr>
+          </w:p>
+        </w:tc>
+        <w:tc>
+          <w:tcPr>
+            <w:tcW w:w="1320" w:type="dxa"/>
+            <w:tcMar>
+              <w:top w:w="90" w:type="dxa"/>
+              <w:left w:w="100" w:type="dxa"/>
+              <w:bottom w:w="90" w:type="dxa"/>
+              <w:right w:w="100" w:type="dxa"/>
+            </w:tcMar>
+          </w:tcPr>
+          <w:p>
+            <w:pPr>
+              <w:rPr>
+                <w:color w:val="1F2937"/>
+                <w:sz w:val="19"/>
+                <w:szCs w:val="19"/>
+              </w:rPr>
+            </w:pPr>
+          </w:p>
+        </w:tc>
+      </w:tr>
+      <w:tr>
+        <w:trPr>
+          <w:cantSplit/>
+        </w:trPr>
+        <w:tc>
+          <w:tcPr>
+            <w:tcW w:w="1150" w:type="dxa"/>
+            <w:tcMar>
+              <w:top w:w="90" w:type="dxa"/>
+              <w:left w:w="100" w:type="dxa"/>
+              <w:bottom w:w="90" w:type="dxa"/>
+              <w:right w:w="100" w:type="dxa"/>
+            </w:tcMar>
+          </w:tcPr>
+          <w:p>
+            <w:pPr>
+              <w:rPr>
+                <w:color w:val="1F2937"/>
+                <w:sz w:val="19"/>
+                <w:szCs w:val="19"/>
+              </w:rPr>
+            </w:pPr>
+          </w:p>
+        </w:tc>
+        <w:tc>
+          <w:tcPr>
+            <w:tcW w:w="3460" w:type="dxa"/>
+            <w:tcMar>
+              <w:top w:w="90" w:type="dxa"/>
+              <w:left w:w="100" w:type="dxa"/>
+              <w:bottom w:w="90" w:type="dxa"/>
+              <w:right w:w="100" w:type="dxa"/>
+            </w:tcMar>
+          </w:tcPr>
+          <w:p>
+            <w:pPr>
+              <w:rPr>
+                <w:color w:val="1F2937"/>
+                <w:sz w:val="19"/>
+                <w:szCs w:val="19"/>
+              </w:rPr>
+            </w:pPr>
+          </w:p>
+        </w:tc>
+        <w:tc>
+          <w:tcPr>
+            <w:tcW w:w="1320" w:type="dxa"/>
+            <w:tcMar>
+              <w:top w:w="90" w:type="dxa"/>
+              <w:left w:w="100" w:type="dxa"/>
+              <w:bottom w:w="90" w:type="dxa"/>
+              <w:right w:w="100" w:type="dxa"/>
+            </w:tcMar>
+          </w:tcPr>
+          <w:p>
+            <w:pPr>
+              <w:rPr>
+                <w:color w:val="1F2937"/>
+                <w:sz w:val="19"/>
+                <w:szCs w:val="19"/>
+              </w:rPr>
+            </w:pPr>
+          </w:p>
+        </w:tc>
+        <w:tc>
+          <w:tcPr>
+            <w:tcW w:w="2110" w:type="dxa"/>
+            <w:tcMar>
+              <w:top w:w="90" w:type="dxa"/>
+              <w:left w:w="100" w:type="dxa"/>
+              <w:bottom w:w="90" w:type="dxa"/>
+              <w:right w:w="100" w:type="dxa"/>
+            </w:tcMar>
+          </w:tcPr>
+          <w:p>
+            <w:pPr>
+              <w:rPr>
+                <w:color w:val="1F2937"/>
+                <w:sz w:val="19"/>
+                <w:szCs w:val="19"/>
+              </w:rPr>
+            </w:pPr>
+          </w:p>
+        </w:tc>
+        <w:tc>
+          <w:tcPr>
+            <w:tcW w:w="1320" w:type="dxa"/>
+            <w:tcMar>
+              <w:top w:w="90" w:type="dxa"/>
+              <w:left w:w="100" w:type="dxa"/>
+              <w:bottom w:w="90" w:type="dxa"/>
+              <w:right w:w="100" w:type="dxa"/>
+            </w:tcMar>
+          </w:tcPr>
+          <w:p>
+            <w:pPr>
+              <w:rPr>
+                <w:color w:val="1F2937"/>
+                <w:sz w:val="19"/>
+                <w:szCs w:val="19"/>
+              </w:rPr>
+            </w:pPr>
+          </w:p>
+        </w:tc>
+      </w:tr>
+      <w:tr>
+        <w:trPr>
+          <w:cantSplit/>
+        </w:trPr>
+        <w:tc>
+          <w:tcPr>
+            <w:tcW w:w="1150" w:type="dxa"/>
+            <w:tcMar>
+              <w:top w:w="90" w:type="dxa"/>
+              <w:left w:w="100" w:type="dxa"/>
+              <w:bottom w:w="90" w:type="dxa"/>
+              <w:right w:w="100" w:type="dxa"/>
+            </w:tcMar>
+          </w:tcPr>
+          <w:p>
+            <w:pPr>
+              <w:rPr>
+                <w:color w:val="1F2937"/>
+                <w:sz w:val="19"/>
+                <w:szCs w:val="19"/>
+              </w:rPr>
+            </w:pPr>
+          </w:p>
+        </w:tc>
+        <w:tc>
+          <w:tcPr>
+            <w:tcW w:w="3460" w:type="dxa"/>
+            <w:tcMar>
+              <w:top w:w="90" w:type="dxa"/>
+              <w:left w:w="100" w:type="dxa"/>
+              <w:bottom w:w="90" w:type="dxa"/>
+              <w:right w:w="100" w:type="dxa"/>
+            </w:tcMar>
+          </w:tcPr>
+          <w:p>
+            <w:pPr>
+              <w:rPr>
+                <w:color w:val="1F2937"/>
+                <w:sz w:val="19"/>
+                <w:szCs w:val="19"/>
+              </w:rPr>
+            </w:pPr>
+          </w:p>
+        </w:tc>
+        <w:tc>
+          <w:tcPr>
+            <w:tcW w:w="1320" w:type="dxa"/>
+            <w:tcMar>
+              <w:top w:w="90" w:type="dxa"/>
+              <w:left w:w="100" w:type="dxa"/>
+              <w:bottom w:w="90" w:type="dxa"/>
+              <w:right w:w="100" w:type="dxa"/>
+            </w:tcMar>
+          </w:tcPr>
+          <w:p>
+            <w:pPr>
+              <w:rPr>
+                <w:color w:val="1F2937"/>
+                <w:sz w:val="19"/>
+                <w:szCs w:val="19"/>
+              </w:rPr>
+            </w:pPr>
+          </w:p>
+        </w:tc>
+        <w:tc>
+          <w:tcPr>
+            <w:tcW w:w="2110" w:type="dxa"/>
+            <w:tcMar>
+              <w:top w:w="90" w:type="dxa"/>
+              <w:left w:w="100" w:type="dxa"/>
+              <w:bottom w:w="90" w:type="dxa"/>
+              <w:right w:w="100" w:type="dxa"/>
+            </w:tcMar>
+          </w:tcPr>
+          <w:p>
+            <w:pPr>
+              <w:rPr>
+                <w:color w:val="1F2937"/>
+                <w:sz w:val="19"/>
+                <w:szCs w:val="19"/>
+              </w:rPr>
+            </w:pPr>
+          </w:p>
+        </w:tc>
+        <w:tc>
+          <w:tcPr>
+            <w:tcW w:w="1320" w:type="dxa"/>
+            <w:tcMar>
+              <w:top w:w="90" w:type="dxa"/>
+              <w:left w:w="100" w:type="dxa"/>
+              <w:bottom w:w="90" w:type="dxa"/>
+              <w:right w:w="100" w:type="dxa"/>
+            </w:tcMar>
+          </w:tcPr>
+          <w:p>
+            <w:pPr>
+              <w:rPr>
+                <w:color w:val="1F2937"/>
+                <w:sz w:val="19"/>
+                <w:szCs w:val="19"/>
+              </w:rPr>
+            </w:pPr>
+          </w:p>
+        </w:tc>
+      </w:tr>
+      <w:tr>
+        <w:trPr>
+          <w:cantSplit/>
+        </w:trPr>
+        <w:tc>
+          <w:tcPr>
+            <w:tcW w:w="1150" w:type="dxa"/>
+            <w:tcMar>
+              <w:top w:w="90" w:type="dxa"/>
+              <w:left w:w="100" w:type="dxa"/>
+              <w:bottom w:w="90" w:type="dxa"/>
+              <w:right w:w="100" w:type="dxa"/>
+            </w:tcMar>
+          </w:tcPr>
+          <w:p>
+            <w:pPr>
+              <w:rPr>
+                <w:color w:val="1F2937"/>
+                <w:sz w:val="19"/>
+                <w:szCs w:val="19"/>
+              </w:rPr>
+            </w:pPr>
+          </w:p>
+        </w:tc>
+        <w:tc>
+          <w:tcPr>
+            <w:tcW w:w="3460" w:type="dxa"/>
+            <w:tcMar>
+              <w:top w:w="90" w:type="dxa"/>
+              <w:left w:w="100" w:type="dxa"/>
+              <w:bottom w:w="90" w:type="dxa"/>
+              <w:right w:w="100" w:type="dxa"/>
+            </w:tcMar>
+          </w:tcPr>
+          <w:p>
+            <w:pPr>
+              <w:rPr>
+                <w:color w:val="1F2937"/>
+                <w:sz w:val="19"/>
+                <w:szCs w:val="19"/>
+              </w:rPr>
+            </w:pPr>
+          </w:p>
+        </w:tc>
+        <w:tc>
+          <w:tcPr>
+            <w:tcW w:w="1320" w:type="dxa"/>
+            <w:tcMar>
+              <w:top w:w="90" w:type="dxa"/>
+              <w:left w:w="100" w:type="dxa"/>
+              <w:bottom w:w="90" w:type="dxa"/>
+              <w:right w:w="100" w:type="dxa"/>
+            </w:tcMar>
+          </w:tcPr>
+          <w:p>
+            <w:pPr>
+              <w:rPr>
+                <w:color w:val="1F2937"/>
+                <w:sz w:val="19"/>
+                <w:szCs w:val="19"/>
+              </w:rPr>
+            </w:pPr>
+          </w:p>
+        </w:tc>
+        <w:tc>
+          <w:tcPr>
+            <w:tcW w:w="2110" w:type="dxa"/>
+            <w:tcMar>
+              <w:top w:w="90" w:type="dxa"/>
+              <w:left w:w="100" w:type="dxa"/>
+              <w:bottom w:w="90" w:type="dxa"/>
+              <w:right w:w="100" w:type="dxa"/>
+            </w:tcMar>
+          </w:tcPr>
+          <w:p>
+            <w:pPr>
+              <w:rPr>
+                <w:color w:val="1F2937"/>
+                <w:sz w:val="19"/>
+                <w:szCs w:val="19"/>
+              </w:rPr>
+            </w:pPr>
+          </w:p>
+        </w:tc>
+        <w:tc>
+          <w:tcPr>
+            <w:tcW w:w="1320" w:type="dxa"/>
+            <w:tcMar>
+              <w:top w:w="90" w:type="dxa"/>
+              <w:left w:w="100" w:type="dxa"/>
+              <w:bottom w:w="90" w:type="dxa"/>
+              <w:right w:w="100" w:type="dxa"/>
+            </w:tcMar>
+          </w:tcPr>
+          <w:p>
+            <w:pPr>
+              <w:rPr>
+                <w:color w:val="1F2937"/>
+                <w:sz w:val="19"/>
+                <w:szCs w:val="19"/>
+              </w:rPr>
+            </w:pPr>
+          </w:p>
+        </w:tc>
+      </w:tr>
+      <w:tr>
+        <w:trPr>
+          <w:cantSplit/>
+        </w:trPr>
+        <w:tc>
+          <w:tcPr>
+            <w:tcW w:w="1150" w:type="dxa"/>
+            <w:tcMar>
+              <w:top w:w="90" w:type="dxa"/>
+              <w:left w:w="100" w:type="dxa"/>
+              <w:bottom w:w="90" w:type="dxa"/>
+              <w:right w:w="100" w:type="dxa"/>
+            </w:tcMar>
+          </w:tcPr>
+          <w:p>
+            <w:pPr>
+              <w:rPr>
+                <w:color w:val="1F2937"/>
+                <w:sz w:val="19"/>
+                <w:szCs w:val="19"/>
+              </w:rPr>
+            </w:pPr>
+          </w:p>
+        </w:tc>
+        <w:tc>
+          <w:tcPr>
+            <w:tcW w:w="3460" w:type="dxa"/>
+            <w:tcMar>
+              <w:top w:w="90" w:type="dxa"/>
+              <w:left w:w="100" w:type="dxa"/>
+              <w:bottom w:w="90" w:type="dxa"/>
+              <w:right w:w="100" w:type="dxa"/>
+            </w:tcMar>
+          </w:tcPr>
+          <w:p>
+            <w:pPr>
+              <w:rPr>
+                <w:color w:val="1F2937"/>
+                <w:sz w:val="19"/>
+                <w:szCs w:val="19"/>
+              </w:rPr>
+            </w:pPr>
+          </w:p>
+        </w:tc>
+        <w:tc>
+          <w:tcPr>
+            <w:tcW w:w="1320" w:type="dxa"/>
+            <w:tcMar>
+              <w:top w:w="90" w:type="dxa"/>
+              <w:left w:w="100" w:type="dxa"/>
+              <w:bottom w:w="90" w:type="dxa"/>
+              <w:right w:w="100" w:type="dxa"/>
+            </w:tcMar>
+          </w:tcPr>
+          <w:p>
+            <w:pPr>
+              <w:rPr>
+                <w:color w:val="1F2937"/>
+                <w:sz w:val="19"/>
+                <w:szCs w:val="19"/>
+              </w:rPr>
+            </w:pPr>
+          </w:p>
+        </w:tc>
+        <w:tc>
+          <w:tcPr>
+            <w:tcW w:w="2110" w:type="dxa"/>
+            <w:tcMar>
+              <w:top w:w="90" w:type="dxa"/>
+              <w:left w:w="100" w:type="dxa"/>
+              <w:bottom w:w="90" w:type="dxa"/>
+              <w:right w:w="100" w:type="dxa"/>
+            </w:tcMar>
+          </w:tcPr>
+          <w:p>
+            <w:pPr>
+              <w:rPr>
+                <w:color w:val="1F2937"/>
+                <w:sz w:val="19"/>
+                <w:szCs w:val="19"/>
+              </w:rPr>
+            </w:pPr>
+          </w:p>
+        </w:tc>
+        <w:tc>
+          <w:tcPr>
+            <w:tcW w:w="1320" w:type="dxa"/>
+            <w:tcMar>
+              <w:top w:w="90" w:type="dxa"/>
+              <w:left w:w="100" w:type="dxa"/>
+              <w:bottom w:w="90" w:type="dxa"/>
+              <w:right w:w="100" w:type="dxa"/>
+            </w:tcMar>
+          </w:tcPr>
+          <w:p>
+            <w:pPr>
+              <w:rPr>
+                <w:color w:val="1F2937"/>
+                <w:sz w:val="19"/>
+                <w:szCs w:val="19"/>
+              </w:rPr>
+            </w:pPr>
+          </w:p>
+        </w:tc>
+      </w:tr>
+      <w:tr>
+        <w:trPr>
+          <w:cantSplit/>
+        </w:trPr>
+        <w:tc>
+          <w:tcPr>
+            <w:tcW w:w="1150" w:type="dxa"/>
+            <w:tcMar>
+              <w:top w:w="90" w:type="dxa"/>
+              <w:left w:w="100" w:type="dxa"/>
+              <w:bottom w:w="90" w:type="dxa"/>
+              <w:right w:w="100" w:type="dxa"/>
+            </w:tcMar>
+          </w:tcPr>
+          <w:p>
+            <w:pPr>
+              <w:rPr>
+                <w:color w:val="1F2937"/>
+                <w:sz w:val="19"/>
+                <w:szCs w:val="19"/>
+              </w:rPr>
+            </w:pPr>
+          </w:p>
+        </w:tc>
+        <w:tc>
+          <w:tcPr>
+            <w:tcW w:w="3460" w:type="dxa"/>
+            <w:tcMar>
+              <w:top w:w="90" w:type="dxa"/>
+              <w:left w:w="100" w:type="dxa"/>
+              <w:bottom w:w="90" w:type="dxa"/>
+              <w:right w:w="100" w:type="dxa"/>
+            </w:tcMar>
+          </w:tcPr>
+          <w:p>
+            <w:pPr>
+              <w:rPr>
+                <w:color w:val="1F2937"/>
+                <w:sz w:val="19"/>
+                <w:szCs w:val="19"/>
+              </w:rPr>
+            </w:pPr>
+          </w:p>
+        </w:tc>
+        <w:tc>
+          <w:tcPr>
+            <w:tcW w:w="1320" w:type="dxa"/>
+            <w:tcMar>
+              <w:top w:w="90" w:type="dxa"/>
+              <w:left w:w="100" w:type="dxa"/>
+              <w:bottom w:w="90" w:type="dxa"/>
+              <w:right w:w="100" w:type="dxa"/>
+            </w:tcMar>
+          </w:tcPr>
+          <w:p>
+            <w:pPr>
+              <w:rPr>
+                <w:color w:val="1F2937"/>
+                <w:sz w:val="19"/>
+                <w:szCs w:val="19"/>
+              </w:rPr>
+            </w:pPr>
+          </w:p>
+        </w:tc>
+        <w:tc>
+          <w:tcPr>
+            <w:tcW w:w="2110" w:type="dxa"/>
+            <w:tcMar>
+              <w:top w:w="90" w:type="dxa"/>
+              <w:left w:w="100" w:type="dxa"/>
+              <w:bottom w:w="90" w:type="dxa"/>
+              <w:right w:w="100" w:type="dxa"/>
+            </w:tcMar>
+          </w:tcPr>
+          <w:p>
+            <w:pPr>
+              <w:rPr>
+                <w:color w:val="1F2937"/>
+                <w:sz w:val="19"/>
+                <w:szCs w:val="19"/>
+              </w:rPr>
+            </w:pPr>
+          </w:p>
+        </w:tc>
+        <w:tc>
+          <w:tcPr>
+            <w:tcW w:w="1320" w:type="dxa"/>
+            <w:tcMar>
+              <w:top w:w="90" w:type="dxa"/>
+              <w:left w:w="100" w:type="dxa"/>
+              <w:bottom w:w="90" w:type="dxa"/>
+              <w:right w:w="100" w:type="dxa"/>
+            </w:tcMar>
+          </w:tcPr>
+          <w:p>
+            <w:pPr>
+              <w:rPr>
+                <w:color w:val="1F2937"/>
+                <w:sz w:val="19"/>
+                <w:szCs w:val="19"/>
+              </w:rPr>
+            </w:pPr>
+          </w:p>
+        </w:tc>
+      </w:tr>
+      <w:tr>
+        <w:trPr>
+          <w:cantSplit/>
+        </w:trPr>
+        <w:tc>
+          <w:tcPr>
+            <w:tcW w:w="1150" w:type="dxa"/>
+            <w:tcMar>
+              <w:top w:w="90" w:type="dxa"/>
+              <w:left w:w="100" w:type="dxa"/>
+              <w:bottom w:w="90" w:type="dxa"/>
+              <w:right w:w="100" w:type="dxa"/>
+            </w:tcMar>
+          </w:tcPr>
+          <w:p>
+            <w:pPr>
+              <w:rPr>
+                <w:color w:val="1F2937"/>
+                <w:sz w:val="19"/>
+                <w:szCs w:val="19"/>
+              </w:rPr>
+            </w:pPr>
+          </w:p>
+        </w:tc>
+        <w:tc>
+          <w:tcPr>
+            <w:tcW w:w="3460" w:type="dxa"/>
+            <w:tcMar>
+              <w:top w:w="90" w:type="dxa"/>
+              <w:left w:w="100" w:type="dxa"/>
+              <w:bottom w:w="90" w:type="dxa"/>
+              <w:right w:w="100" w:type="dxa"/>
+            </w:tcMar>
+          </w:tcPr>
+          <w:p>
+            <w:pPr>
+              <w:rPr>
+                <w:color w:val="1F2937"/>
+                <w:sz w:val="19"/>
+                <w:szCs w:val="19"/>
+              </w:rPr>
+            </w:pPr>
+          </w:p>
+        </w:tc>
+        <w:tc>
+          <w:tcPr>
+            <w:tcW w:w="1320" w:type="dxa"/>
+            <w:tcMar>
+              <w:top w:w="90" w:type="dxa"/>
+              <w:left w:w="100" w:type="dxa"/>
+              <w:bottom w:w="90" w:type="dxa"/>
+              <w:right w:w="100" w:type="dxa"/>
+            </w:tcMar>
+          </w:tcPr>
+          <w:p>
+            <w:pPr>
+              <w:rPr>
+                <w:color w:val="1F2937"/>
+                <w:sz w:val="19"/>
+                <w:szCs w:val="19"/>
+              </w:rPr>
+            </w:pPr>
+          </w:p>
+        </w:tc>
+        <w:tc>
+          <w:tcPr>
+            <w:tcW w:w="2110" w:type="dxa"/>
+            <w:tcMar>
+              <w:top w:w="90" w:type="dxa"/>
+              <w:left w:w="100" w:type="dxa"/>
+              <w:bottom w:w="90" w:type="dxa"/>
+              <w:right w:w="100" w:type="dxa"/>
+            </w:tcMar>
+          </w:tcPr>
+          <w:p>
+            <w:pPr>
+              <w:rPr>
+                <w:color w:val="1F2937"/>
+                <w:sz w:val="19"/>
+                <w:szCs w:val="19"/>
+              </w:rPr>
+            </w:pPr>
+          </w:p>
+        </w:tc>
+        <w:tc>
+          <w:tcPr>
+            <w:tcW w:w="1320" w:type="dxa"/>
+            <w:tcMar>
+              <w:top w:w="90" w:type="dxa"/>
+              <w:left w:w="100" w:type="dxa"/>
+              <w:bottom w:w="90" w:type="dxa"/>
+              <w:right w:w="100" w:type="dxa"/>
+            </w:tcMar>
+          </w:tcPr>
+          <w:p>
+            <w:pPr>
+              <w:rPr>
+                <w:color w:val="1F2937"/>
+                <w:sz w:val="19"/>
+                <w:szCs w:val="19"/>
+              </w:rPr>
+            </w:pPr>
+          </w:p>
+        </w:tc>
+      </w:tr>
     </w:tbl>
     <w:p>
       <w:r>
@@ -3055,7 +5152,7 @@
       </w:tblGrid>
       <w:tr>
         <w:trPr>
-          <w:trHeight w:val="2448"/>
+          <w:trHeight w:val="11664"/>
         </w:trPr>
         <w:tc>
           <w:tcPr>
@@ -3194,7 +5291,7 @@
       </w:tblGrid>
       <w:tr>
         <w:trPr>
-          <w:trHeight w:val="3168"/>
+          <w:trHeight w:val="9504"/>
         </w:trPr>
         <w:tc>
           <w:tcPr>
@@ -3235,6 +5332,8 @@
             <w:r>
               <w:t xml:space="preserve"> </w:t>
             </w:r>
+            <w:bookmarkStart w:id="0" w:name="_GoBack"/>
+            <w:bookmarkEnd w:id="0"/>
           </w:p>
         </w:tc>
       </w:tr>

</xml_diff>